<commit_message>
build: publish structurally checked Master Speaking proof editions
</commit_message>
<xml_diff>
--- a/proof/Master Speaking — Teacher's Book (TOEFL House).docx
+++ b/proof/Master Speaking — Teacher's Book (TOEFL House).docx
@@ -1509,6 +1509,89 @@
         <w:pStyle w:val="Heading2"/>
       </w:pPr>
       <w:r>
+        <w:t>No-internet alternative listening</w:t>
+      </w:r>
+    </w:p>
+    <w:p>
+      <w:pPr>
+        <w:pStyle w:val="StudioNote"/>
+      </w:pPr>
+      <w:r>
+        <w:t>Read this original passage once without interruptions, then a second time for note-taking. This is NOT the transcript of the publisher-hosted video. Students use the corresponding questions in their speaking studio.</w:t>
+      </w:r>
+    </w:p>
+    <w:p>
+      <w:r>
+        <w:rPr>
+          <w:b/>
+          <w:color w:val="0D696E"/>
+        </w:rPr>
+        <w:t>A goal that survived a busy week</w:t>
+      </w:r>
+    </w:p>
+    <w:p>
+      <w:r>
+        <w:t>When Farid decided to improve his English, he made an ambitious plan. He promised to practise for one hour every evening. On Monday he spoke for an hour. On Tuesday he did the same. By Wednesday, however, he had extra work and came home late. He missed his practice time and felt that the whole plan had failed.</w:t>
+      </w:r>
+    </w:p>
+    <w:p>
+      <w:r>
+        <w:t>His classmate suggested a smaller routine: record a one-minute answer after dinner on four evenings each week. On Friday, Farid could listen to the recordings and improve one sentence. The routine was short enough to fit a busy week. They also agreed on a backup. If he missed the evening practice, he could record the answer the next morning.</w:t>
+      </w:r>
+    </w:p>
+    <w:p>
+      <w:r>
+        <w:t>Farid still hoped to give a three-minute speech in six weeks. The goal had not changed, but the daily action was clearer and more flexible. Instead of counting only the final result, he began noticing how much more clearly he could express one idea.</w:t>
+      </w:r>
+    </w:p>
+    <w:p>
+      <w:pPr>
+        <w:pStyle w:val="Heading3"/>
+      </w:pPr>
+      <w:r>
+        <w:t>Answers for this original passage</w:t>
+      </w:r>
+    </w:p>
+    <w:p>
+      <w:r>
+        <w:t>1. What was Farid's first practice promise?  Answer: One hour of English practice every evening.</w:t>
+      </w:r>
+    </w:p>
+    <w:p>
+      <w:r>
+        <w:t>2. What made his original plan difficult?  Answer: Extra work made him return home late and miss his practice.</w:t>
+      </w:r>
+    </w:p>
+    <w:p>
+      <w:r>
+        <w:t>3. What was the smaller routine?  Answer: A one-minute recording after dinner four evenings each week, plus a Friday review.</w:t>
+      </w:r>
+    </w:p>
+    <w:p>
+      <w:r>
+        <w:t>4. What was Farid's fallback when he missed the evening?  Answer: Record the answer the next morning.</w:t>
+      </w:r>
+    </w:p>
+    <w:p>
+      <w:r>
+        <w:rPr>
+          <w:b/>
+          <w:color w:val="0D696E"/>
+          <w:sz w:val="20"/>
+        </w:rPr>
+        <w:t>After-listening interaction</w:t>
+      </w:r>
+    </w:p>
+    <w:p>
+      <w:r>
+        <w:t>What matters more in Farid's story: ambition, a clear routine, or a workable fallback? Support your choice.</w:t>
+      </w:r>
+    </w:p>
+    <w:p>
+      <w:pPr>
+        <w:pStyle w:val="Heading2"/>
+      </w:pPr>
+      <w:r>
         <w:t>Challenge and mini-presentation</w:t>
       </w:r>
     </w:p>
@@ -1970,6 +2053,89 @@
         <w:pStyle w:val="Heading2"/>
       </w:pPr>
       <w:r>
+        <w:t>No-internet alternative listening</w:t>
+      </w:r>
+    </w:p>
+    <w:p>
+      <w:pPr>
+        <w:pStyle w:val="StudioNote"/>
+      </w:pPr>
+      <w:r>
+        <w:t>Read this original passage once without interruptions, then a second time for note-taking. This is NOT the transcript of the publisher-hosted video. Students use the corresponding questions in their speaking studio.</w:t>
+      </w:r>
+    </w:p>
+    <w:p>
+      <w:r>
+        <w:rPr>
+          <w:b/>
+          <w:color w:val="0D696E"/>
+        </w:rPr>
+        <w:t>A deadline and two explanations</w:t>
+      </w:r>
+    </w:p>
+    <w:p>
+      <w:r>
+        <w:t>Mina and Omid were preparing a short presentation. They agreed to finish it by Thursday, but when Thursday arrived, the slides were still incomplete. Mina was frustrated. She had researched the topic and believed Omid had promised to design the slides.</w:t>
+      </w:r>
+    </w:p>
+    <w:p>
+      <w:r>
+        <w:t>Omid explained that he understood his task differently. He thought he was responsible for checking sources, not design. Mina was about to say, 'You never help,' but stopped. Instead she said, 'We still need the slides, and I'm worried about tomorrow. Can we decide who will do each part?'</w:t>
+      </w:r>
+    </w:p>
+    <w:p>
+      <w:r>
+        <w:t>They made a plan. Omid would check the sources and send a short summary that evening. Mina would finish the design, and both would meet for fifteen minutes the following morning. Their misunderstanding had not disappeared, but it no longer stopped them from working together.</w:t>
+      </w:r>
+    </w:p>
+    <w:p>
+      <w:pPr>
+        <w:pStyle w:val="Heading3"/>
+      </w:pPr>
+      <w:r>
+        <w:t>Answers for this original passage</w:t>
+      </w:r>
+    </w:p>
+    <w:p>
+      <w:r>
+        <w:t>1. Why was Mina frustrated?  Answer: The presentation slides were unfinished near the deadline.</w:t>
+      </w:r>
+    </w:p>
+    <w:p>
+      <w:r>
+        <w:t>2. How did Omid understand his role?  Answer: He believed he was checking sources rather than designing slides.</w:t>
+      </w:r>
+    </w:p>
+    <w:p>
+      <w:r>
+        <w:t>3. What did Mina say instead of blaming Omid?  Answer: She described the missing slides and asked to agree on responsibilities.</w:t>
+      </w:r>
+    </w:p>
+    <w:p>
+      <w:r>
+        <w:t>4. How did they plan to finish?  Answer: Omid checked sources, Mina designed slides, and they reviewed together the next morning.</w:t>
+      </w:r>
+    </w:p>
+    <w:p>
+      <w:r>
+        <w:rPr>
+          <w:b/>
+          <w:color w:val="0D696E"/>
+          <w:sz w:val="20"/>
+        </w:rPr>
+        <w:t>After-listening interaction</w:t>
+      </w:r>
+    </w:p>
+    <w:p>
+      <w:r>
+        <w:t>Which single sentence helped the conversation change direction? How could you adapt it to another fictional conflict?</w:t>
+      </w:r>
+    </w:p>
+    <w:p>
+      <w:pPr>
+        <w:pStyle w:val="Heading2"/>
+      </w:pPr>
+      <w:r>
         <w:t>Challenge and mini-presentation</w:t>
       </w:r>
     </w:p>
@@ -2431,6 +2597,89 @@
         <w:pStyle w:val="Heading2"/>
       </w:pPr>
       <w:r>
+        <w:t>No-internet alternative listening</w:t>
+      </w:r>
+    </w:p>
+    <w:p>
+      <w:pPr>
+        <w:pStyle w:val="StudioNote"/>
+      </w:pPr>
+      <w:r>
+        <w:t>Read this original passage once without interruptions, then a second time for note-taking. This is NOT the transcript of the publisher-hosted video. Students use the corresponding questions in their speaking studio.</w:t>
+      </w:r>
+    </w:p>
+    <w:p>
+      <w:r>
+        <w:rPr>
+          <w:b/>
+          <w:color w:val="0D696E"/>
+        </w:rPr>
+        <w:t>A grant with more than one good use</w:t>
+      </w:r>
+    </w:p>
+    <w:p>
+      <w:r>
+        <w:t>A community learning center received a hypothetical donation of thirty thousand afghanis. Three students were asked how the money should be used. One wanted to repair a classroom fan for twelve thousand afghanis. The room was uncomfortable in hot weather, and some learners found it difficult to concentrate.</w:t>
+      </w:r>
+    </w:p>
+    <w:p>
+      <w:r>
+        <w:t>Another student preferred buying graded readers for ten thousand. Books could be shared across classes for a long time. The third suggested spending eight thousand on a public speaking event, arguing that an event could help new learners feel included.</w:t>
+      </w:r>
+    </w:p>
+    <w:p>
+      <w:r>
+        <w:t>After listening to one another, the group chose to repair the fan and buy the readers. That would use twenty-two thousand afghanis and leave eight thousand. They decided to keep the remaining money for a future need rather than spend it immediately. Each person still valued a different benefit, but they agreed that a good decision should balance urgency, access and long-term value.</w:t>
+      </w:r>
+    </w:p>
+    <w:p>
+      <w:pPr>
+        <w:pStyle w:val="Heading3"/>
+      </w:pPr>
+      <w:r>
+        <w:t>Answers for this original passage</w:t>
+      </w:r>
+    </w:p>
+    <w:p>
+      <w:r>
+        <w:t>1. What was the total donation?  Answer: 30,000 afghanis.</w:t>
+      </w:r>
+    </w:p>
+    <w:p>
+      <w:r>
+        <w:t>2. How much would the fan repair and readers cost together?  Answer: 22,000 afghanis.</w:t>
+      </w:r>
+    </w:p>
+    <w:p>
+      <w:r>
+        <w:t>3. How much did the group decide to reserve?  Answer: 8,000 afghanis.</w:t>
+      </w:r>
+    </w:p>
+    <w:p>
+      <w:r>
+        <w:t>4. Why did they not choose the event immediately?  Answer: They prioritized the fan and books and chose to save the remaining funds for a later need.</w:t>
+      </w:r>
+    </w:p>
+    <w:p>
+      <w:r>
+        <w:rPr>
+          <w:b/>
+          <w:color w:val="0D696E"/>
+          <w:sz w:val="20"/>
+        </w:rPr>
+        <w:t>After-listening interaction</w:t>
+      </w:r>
+    </w:p>
+    <w:p>
+      <w:r>
+        <w:t>Would you make the same allocation? Compare one practical benefit and one opportunity cost.</w:t>
+      </w:r>
+    </w:p>
+    <w:p>
+      <w:pPr>
+        <w:pStyle w:val="Heading2"/>
+      </w:pPr>
+      <w:r>
         <w:t>Challenge and mini-presentation</w:t>
       </w:r>
     </w:p>
@@ -2892,6 +3141,89 @@
         <w:pStyle w:val="Heading2"/>
       </w:pPr>
       <w:r>
+        <w:t>No-internet alternative listening</w:t>
+      </w:r>
+    </w:p>
+    <w:p>
+      <w:pPr>
+        <w:pStyle w:val="StudioNote"/>
+      </w:pPr>
+      <w:r>
+        <w:t>Read this original passage once without interruptions, then a second time for note-taking. This is NOT the transcript of the publisher-hosted video. Students use the corresponding questions in their speaking studio.</w:t>
+      </w:r>
+    </w:p>
+    <w:p>
+      <w:r>
+        <w:rPr>
+          <w:b/>
+          <w:color w:val="0D696E"/>
+        </w:rPr>
+        <w:t>The quotation that nobody could find</w:t>
+      </w:r>
+    </w:p>
+    <w:p>
+      <w:r>
+        <w:t>Zahra used an AI writing tool to plan a school talk about plastic waste. The outline was clear and sounded convincing. It even included a quotation attributed to a famous international organization. When Zahra searched for the original quotation, however, she could not find it on the organization's website.</w:t>
+      </w:r>
+    </w:p>
+    <w:p>
+      <w:r>
+        <w:t>Her first reaction was to keep the sentence because it sounded impressive. Then she remembered that a confident tone does not make a claim true. She removed the quotation, checked the underlying topic using sources she could identify, and wrote her own explanation.</w:t>
+      </w:r>
+    </w:p>
+    <w:p>
+      <w:r>
+        <w:t>Later a classmate suggested copying student names and grades into the same tool to personalize feedback. Zahra objected. The class had not agreed to share that information, and the task did not require personal data. Together they made a short rule: use tools to explore ideas, verify important claims, and protect information that belongs to other people.</w:t>
+      </w:r>
+    </w:p>
+    <w:p>
+      <w:pPr>
+        <w:pStyle w:val="Heading3"/>
+      </w:pPr>
+      <w:r>
+        <w:t>Answers for this original passage</w:t>
+      </w:r>
+    </w:p>
+    <w:p>
+      <w:r>
+        <w:t>1. Why did Zahra remove the quotation?  Answer: She could not verify it in the attributed organization's source.</w:t>
+      </w:r>
+    </w:p>
+    <w:p>
+      <w:r>
+        <w:t>2. Did the AI-generated paragraph sound clear?  Answer: Yes, but clarity did not establish truth.</w:t>
+      </w:r>
+    </w:p>
+    <w:p>
+      <w:r>
+        <w:t>3. What information did Zahra decline to upload?  Answer: Student names and grades.</w:t>
+      </w:r>
+    </w:p>
+    <w:p>
+      <w:r>
+        <w:t>4. What three rules did the class propose?  Answer: Explore ideas, verify important claims, and protect other people's private information.</w:t>
+      </w:r>
+    </w:p>
+    <w:p>
+      <w:r>
+        <w:rPr>
+          <w:b/>
+          <w:color w:val="0D696E"/>
+          <w:sz w:val="20"/>
+        </w:rPr>
+        <w:t>After-listening interaction</w:t>
+      </w:r>
+    </w:p>
+    <w:p>
+      <w:r>
+        <w:t>What would you say to someone who argues, 'The answer sounds professional, so it must be right'?</w:t>
+      </w:r>
+    </w:p>
+    <w:p>
+      <w:pPr>
+        <w:pStyle w:val="Heading2"/>
+      </w:pPr>
+      <w:r>
         <w:t>Challenge and mini-presentation</w:t>
       </w:r>
     </w:p>
@@ -3353,6 +3685,89 @@
         <w:pStyle w:val="Heading2"/>
       </w:pPr>
       <w:r>
+        <w:t>No-internet alternative listening</w:t>
+      </w:r>
+    </w:p>
+    <w:p>
+      <w:pPr>
+        <w:pStyle w:val="StudioNote"/>
+      </w:pPr>
+      <w:r>
+        <w:t>Read this original passage once without interruptions, then a second time for note-taking. This is NOT the transcript of the publisher-hosted video. Students use the corresponding questions in their speaking studio.</w:t>
+      </w:r>
+    </w:p>
+    <w:p>
+      <w:r>
+        <w:rPr>
+          <w:b/>
+          <w:color w:val="0D696E"/>
+        </w:rPr>
+        <w:t>A small promise that rebuilt trust</w:t>
+      </w:r>
+    </w:p>
+    <w:p>
+      <w:r>
+        <w:t>Two friends shared a quiet room where they studied. For three weekends, Laila had cleaned the room alone. She was beginning to feel resentful, but she did not know why her friend Haroon had missed the work.</w:t>
+      </w:r>
+    </w:p>
+    <w:p>
+      <w:r>
+        <w:t>When they spoke, Laila described the situation instead of calling him lazy. Haroon explained that he had a Saturday class and could not stay. He apologized for failing to discuss the problem earlier. Laila asked whether Sunday would be possible. Haroon agreed to clean on Sunday mornings and buy supplies that week.</w:t>
+      </w:r>
+    </w:p>
+    <w:p>
+      <w:r>
+        <w:t>They wrote the arrangement on a small card and agreed to discuss it again the following weekend. The conversation did not solve every future disagreement. It did, however, turn an unclear expectation into a shared, practical promise. Both friends now understood what would happen and when.</w:t>
+      </w:r>
+    </w:p>
+    <w:p>
+      <w:pPr>
+        <w:pStyle w:val="Heading3"/>
+      </w:pPr>
+      <w:r>
+        <w:t>Answers for this original passage</w:t>
+      </w:r>
+    </w:p>
+    <w:p>
+      <w:r>
+        <w:t>1. Why had Laila become frustrated?  Answer: She had cleaned the shared room alone for three weekends.</w:t>
+      </w:r>
+    </w:p>
+    <w:p>
+      <w:r>
+        <w:t>2. What prevented Haroon from cleaning on Saturday?  Answer: He had a Saturday class.</w:t>
+      </w:r>
+    </w:p>
+    <w:p>
+      <w:r>
+        <w:t>3. What did they agree Haroon would do?  Answer: Clean on Sunday mornings and buy supplies that week.</w:t>
+      </w:r>
+    </w:p>
+    <w:p>
+      <w:r>
+        <w:t>4. Why did they write down the plan?  Answer: To make responsibilities and review time clear.</w:t>
+      </w:r>
+    </w:p>
+    <w:p>
+      <w:r>
+        <w:rPr>
+          <w:b/>
+          <w:color w:val="0D696E"/>
+          <w:sz w:val="20"/>
+        </w:rPr>
+        <w:t>After-listening interaction</w:t>
+      </w:r>
+    </w:p>
+    <w:p>
+      <w:r>
+        <w:t>How is a specific agreement different from the vague promise 'I'll help more'?</w:t>
+      </w:r>
+    </w:p>
+    <w:p>
+      <w:pPr>
+        <w:pStyle w:val="Heading2"/>
+      </w:pPr>
+      <w:r>
         <w:t>Challenge and mini-presentation</w:t>
       </w:r>
     </w:p>
@@ -3814,6 +4229,89 @@
         <w:pStyle w:val="Heading2"/>
       </w:pPr>
       <w:r>
+        <w:t>No-internet alternative listening</w:t>
+      </w:r>
+    </w:p>
+    <w:p>
+      <w:pPr>
+        <w:pStyle w:val="StudioNote"/>
+      </w:pPr>
+      <w:r>
+        <w:t>Read this original passage once without interruptions, then a second time for note-taking. This is NOT the transcript of the publisher-hosted video. Students use the corresponding questions in their speaking studio.</w:t>
+      </w:r>
+    </w:p>
+    <w:p>
+      <w:r>
+        <w:rPr>
+          <w:b/>
+          <w:color w:val="0D696E"/>
+        </w:rPr>
+        <w:t>Two suppliers, one classroom</w:t>
+      </w:r>
+    </w:p>
+    <w:p>
+      <w:r>
+        <w:t>A learning center needed a new set of microphones. An international supplier offered a lower price, a larger selection and a longer delivery time. A local shop charged more but could deliver quickly and repair the microphones if something went wrong.</w:t>
+      </w:r>
+    </w:p>
+    <w:p>
+      <w:r>
+        <w:t>At first, the center wanted to order everything from the cheaper supplier. Then the manager asked a different question: 'What happens if the shipment is delayed just before our speaking event?' The team realized that price was only one part of the decision.</w:t>
+      </w:r>
+    </w:p>
+    <w:p>
+      <w:r>
+        <w:t>They chose to buy the essential microphones locally and order a few specialist items from abroad. The mixed approach cost more at first, but it made the event less dependent on one delivery. The decision showed that international connections can expand opportunities while also creating risks that local plans need to manage.</w:t>
+      </w:r>
+    </w:p>
+    <w:p>
+      <w:pPr>
+        <w:pStyle w:val="Heading3"/>
+      </w:pPr>
+      <w:r>
+        <w:t>Answers for this original passage</w:t>
+      </w:r>
+    </w:p>
+    <w:p>
+      <w:r>
+        <w:t>1. What advantages did the international supplier offer?  Answer: A lower price and wider selection.</w:t>
+      </w:r>
+    </w:p>
+    <w:p>
+      <w:r>
+        <w:t>2. What advantages did the local shop offer?  Answer: Fast delivery and local repair support.</w:t>
+      </w:r>
+    </w:p>
+    <w:p>
+      <w:r>
+        <w:t>3. What risk changed the team's decision?  Answer: A possible shipping delay before the speaking event.</w:t>
+      </w:r>
+    </w:p>
+    <w:p>
+      <w:r>
+        <w:t>4. What policy did the center choose?  Answer: Essential microphones locally, specialist items internationally.</w:t>
+      </w:r>
+    </w:p>
+    <w:p>
+      <w:r>
+        <w:rPr>
+          <w:b/>
+          <w:color w:val="0D696E"/>
+          <w:sz w:val="20"/>
+        </w:rPr>
+        <w:t>After-listening interaction</w:t>
+      </w:r>
+    </w:p>
+    <w:p>
+      <w:r>
+        <w:t>Is the least expensive option always the best value? Use the microphones as an example.</w:t>
+      </w:r>
+    </w:p>
+    <w:p>
+      <w:pPr>
+        <w:pStyle w:val="Heading2"/>
+      </w:pPr>
+      <w:r>
         <w:t>Challenge and mini-presentation</w:t>
       </w:r>
     </w:p>
@@ -4268,6 +4766,89 @@
       </w:pPr>
       <w:r>
         <w:t>A: Exactly. Let's assess whether the message is understandable and the person can respond.</w:t>
+      </w:r>
+    </w:p>
+    <w:p>
+      <w:pPr>
+        <w:pStyle w:val="Heading2"/>
+      </w:pPr>
+      <w:r>
+        <w:t>No-internet alternative listening</w:t>
+      </w:r>
+    </w:p>
+    <w:p>
+      <w:pPr>
+        <w:pStyle w:val="StudioNote"/>
+      </w:pPr>
+      <w:r>
+        <w:t>Read this original passage once without interruptions, then a second time for note-taking. This is NOT the transcript of the publisher-hosted video. Students use the corresponding questions in their speaking studio.</w:t>
+      </w:r>
+    </w:p>
+    <w:p>
+      <w:r>
+        <w:rPr>
+          <w:b/>
+          <w:color w:val="0D696E"/>
+        </w:rPr>
+        <w:t>An interview that measured understanding</w:t>
+      </w:r>
+    </w:p>
+    <w:p>
+      <w:r>
+        <w:t>A scholarship panel was interviewing applicants for an English-medium course. One applicant spoke with a strong regional accent but answered clearly and asked a useful question when an instruction was ambiguous. Another applicant used impressive vocabulary yet did not respond directly to the panel's follow-up question.</w:t>
+      </w:r>
+    </w:p>
+    <w:p>
+      <w:r>
+        <w:t>The panel reviewed its scoring method. One member said that sounding like a native speaker should not be a requirement. Another pointed out that students still need enough language ability to participate in classes. They agreed on three observable skills: explaining a relevant idea, understanding questions and clarifying a misunderstanding.</w:t>
+      </w:r>
+    </w:p>
+    <w:p>
+      <w:r>
+        <w:t>At the next interview, the panel gave everyone the same task and invited candidates to ask for clarification. It did not promise that every applicant would succeed. It aimed to judge communication fairly, using evidence from what people actually said and understood rather than assumptions about accent or background.</w:t>
+      </w:r>
+    </w:p>
+    <w:p>
+      <w:pPr>
+        <w:pStyle w:val="Heading3"/>
+      </w:pPr>
+      <w:r>
+        <w:t>Answers for this original passage</w:t>
+      </w:r>
+    </w:p>
+    <w:p>
+      <w:r>
+        <w:t>1. What did the first applicant do well?  Answer: Answered clearly and asked for clarification when necessary.</w:t>
+      </w:r>
+    </w:p>
+    <w:p>
+      <w:r>
+        <w:t>2. What did the second applicant struggle with?  Answer: Responding directly to a follow-up question.</w:t>
+      </w:r>
+    </w:p>
+    <w:p>
+      <w:r>
+        <w:t>3. What three skills did the panel choose to assess?  Answer: Explaining relevant ideas, understanding questions, and clarifying misunderstandings.</w:t>
+      </w:r>
+    </w:p>
+    <w:p>
+      <w:r>
+        <w:t>4. Did the panel remove all language requirements?  Answer: No, it retained observable communication requirements.</w:t>
+      </w:r>
+    </w:p>
+    <w:p>
+      <w:r>
+        <w:rPr>
+          <w:b/>
+          <w:color w:val="0D696E"/>
+          <w:sz w:val="20"/>
+        </w:rPr>
+        <w:t>After-listening interaction</w:t>
+      </w:r>
+    </w:p>
+    <w:p>
+      <w:r>
+        <w:t>What is the difference between clear English and copying a particular accent? Give a practical interview example.</w:t>
       </w:r>
     </w:p>
     <w:p>

</xml_diff>